<commit_message>
Add all project code
</commit_message>
<xml_diff>
--- a/resources/templates/Appointment Form Generated Template.docx
+++ b/resources/templates/Appointment Form Generated Template.docx
@@ -507,7 +507,6 @@
           <w:color w:val="000000"/>
         </w:rPr>
       </w:pPr>
-      <w:bookmarkStart w:id="0" w:name="_GoBack"/>
       <w:r>
         <w:rPr>
           <w:b/>
@@ -575,7 +574,6 @@
           </mc:Fallback>
         </mc:AlternateContent>
       </w:r>
-      <w:bookmarkEnd w:id="0"/>
       <w:r>
         <w:rPr>
           <w:b/>
@@ -3595,7 +3593,7 @@
                                 <w:sz w:val="22"/>
                                 <w:szCs w:val="22"/>
                               </w:rPr>
-                              <w:t xml:space="preserve">      Page   475     .</w:t>
+                              <w:t xml:space="preserve">      Page   475     </w:t>
                             </w:r>
                           </w:p>
                         </w:txbxContent>
@@ -3812,7 +3810,7 @@
                           <w:sz w:val="22"/>
                           <w:szCs w:val="22"/>
                         </w:rPr>
-                        <w:t xml:space="preserve">      Page   475     .</w:t>
+                        <w:t xml:space="preserve">      Page   475     </w:t>
                       </w:r>
                     </w:p>
                   </w:txbxContent>
@@ -4423,6 +4421,7 @@
                             <w:pPr>
                               <w:jc w:val="center"/>
                               <w:rPr>
+                                <w:rFonts w:hint="default"/>
                                 <w:b/>
                                 <w:sz w:val="22"/>
                                 <w:szCs w:val="22"/>
@@ -4431,12 +4430,13 @@
                             </w:pPr>
                             <w:r>
                               <w:rPr>
+                                <w:rFonts w:hint="default"/>
                                 <w:b/>
                                 <w:sz w:val="22"/>
                                 <w:szCs w:val="22"/>
                                 <w:lang w:val="en-PH"/>
                               </w:rPr>
-                              <w:t>N/A</w:t>
+                              <w:t>${natural_vacancy}</w:t>
                             </w:r>
                           </w:p>
                         </w:txbxContent>
@@ -4463,6 +4463,7 @@
                       <w:pPr>
                         <w:jc w:val="center"/>
                         <w:rPr>
+                          <w:rFonts w:hint="default"/>
                           <w:b/>
                           <w:sz w:val="22"/>
                           <w:szCs w:val="22"/>
@@ -4471,12 +4472,13 @@
                       </w:pPr>
                       <w:r>
                         <w:rPr>
+                          <w:rFonts w:hint="default"/>
                           <w:b/>
                           <w:sz w:val="22"/>
                           <w:szCs w:val="22"/>
                           <w:lang w:val="en-PH"/>
                         </w:rPr>
-                        <w:t>N/A</w:t>
+                        <w:t>${natural_vacancy}</w:t>
                       </w:r>
                     </w:p>
                   </w:txbxContent>
@@ -8423,6 +8425,8 @@
           <w:rStyle w:val="23"/>
         </w:rPr>
       </w:pPr>
+      <w:bookmarkStart w:id="0" w:name="_GoBack"/>
+      <w:bookmarkEnd w:id="0"/>
       <w:r>
         <w:rPr>
           <w:b/>
@@ -8512,20 +8516,14 @@
                             </w:r>
                             <w:r>
                               <w:rPr>
+                                <w:rFonts w:hint="default"/>
                                 <w:color w:val="000000"/>
                                 <w:sz w:val="24"/>
                                 <w:szCs w:val="24"/>
                                 <w:u w:val="single"/>
-                              </w:rPr>
-                              <w:t xml:space="preserve">June 2 to June 15, 2026 </w:t>
-                            </w:r>
-                            <w:r>
-                              <w:rPr>
-                                <w:color w:val="000000"/>
-                                <w:sz w:val="24"/>
-                                <w:szCs w:val="24"/>
-                              </w:rPr>
-                              <w:t xml:space="preserve">and posted in three (3) conspicuous places from </w:t>
+                                <w:lang w:val="en-PH"/>
+                              </w:rPr>
+                              <w:t>${date_of_appointment}</w:t>
                             </w:r>
                             <w:r>
                               <w:rPr>
@@ -8534,24 +8532,94 @@
                                 <w:szCs w:val="24"/>
                                 <w:u w:val="single"/>
                               </w:rPr>
-                              <w:t xml:space="preserve">June 2 to June 15, 2026 </w:t>
-                            </w:r>
-                            <w:r>
-                              <w:rPr>
-                                <w:color w:val="000000"/>
-                                <w:sz w:val="24"/>
-                                <w:szCs w:val="24"/>
-                              </w:rPr>
-                              <w:t xml:space="preserve">in consonance with RA No. 7041. The assessment by the Human Resource Merit Promotion and Selection Board (HRMPSB) started on </w:t>
-                            </w:r>
-                            <w:r>
-                              <w:rPr>
+                              <w:t xml:space="preserve"> to </w:t>
+                            </w:r>
+                            <w:r>
+                              <w:rPr>
+                                <w:rFonts w:hint="default"/>
                                 <w:color w:val="000000"/>
                                 <w:sz w:val="24"/>
                                 <w:szCs w:val="24"/>
                                 <w:u w:val="single"/>
-                              </w:rPr>
-                              <w:t>June 16, 2026</w:t>
+                                <w:lang w:val="en-PH"/>
+                              </w:rPr>
+                              <w:t>${date_signed}</w:t>
+                            </w:r>
+                            <w:r>
+                              <w:rPr>
+                                <w:color w:val="000000"/>
+                                <w:sz w:val="24"/>
+                                <w:szCs w:val="24"/>
+                                <w:u w:val="single"/>
+                              </w:rPr>
+                              <w:t xml:space="preserve"> </w:t>
+                            </w:r>
+                            <w:r>
+                              <w:rPr>
+                                <w:color w:val="000000"/>
+                                <w:sz w:val="24"/>
+                                <w:szCs w:val="24"/>
+                              </w:rPr>
+                              <w:t xml:space="preserve">and posted in three (3) conspicuous places from </w:t>
+                            </w:r>
+                            <w:r>
+                              <w:rPr>
+                                <w:rFonts w:hint="default"/>
+                                <w:color w:val="000000"/>
+                                <w:sz w:val="24"/>
+                                <w:szCs w:val="24"/>
+                                <w:u w:val="single"/>
+                                <w:lang w:val="en-PH"/>
+                              </w:rPr>
+                              <w:t>${date_of_appointment}</w:t>
+                            </w:r>
+                            <w:r>
+                              <w:rPr>
+                                <w:color w:val="000000"/>
+                                <w:sz w:val="24"/>
+                                <w:szCs w:val="24"/>
+                                <w:u w:val="single"/>
+                              </w:rPr>
+                              <w:t xml:space="preserve"> to</w:t>
+                            </w:r>
+                            <w:r>
+                              <w:rPr>
+                                <w:rFonts w:hint="default"/>
+                                <w:color w:val="000000"/>
+                                <w:sz w:val="24"/>
+                                <w:szCs w:val="24"/>
+                                <w:u w:val="single"/>
+                                <w:lang w:val="en-PH"/>
+                              </w:rPr>
+                              <w:t xml:space="preserve"> ${date_signed}</w:t>
+                            </w:r>
+                            <w:r>
+                              <w:rPr>
+                                <w:color w:val="000000"/>
+                                <w:sz w:val="24"/>
+                                <w:szCs w:val="24"/>
+                                <w:u w:val="single"/>
+                              </w:rPr>
+                              <w:t xml:space="preserve"> </w:t>
+                            </w:r>
+                            <w:r>
+                              <w:rPr>
+                                <w:color w:val="000000"/>
+                                <w:sz w:val="24"/>
+                                <w:szCs w:val="24"/>
+                              </w:rPr>
+                              <w:t xml:space="preserve">in consonance with RA No. 7041. The assessment by the Human Resource Merit Promotion and Selection Board (HRMPSB) started on </w:t>
+                            </w:r>
+                            <w:r>
+                              <w:rPr>
+                                <w:rFonts w:hint="default"/>
+                                <w:color w:val="000000"/>
+                                <w:sz w:val="24"/>
+                                <w:szCs w:val="24"/>
+                                <w:u w:val="single"/>
+                                <w:lang w:val="en-PH"/>
+                              </w:rPr>
+                              <w:t>${effectivity_date}</w:t>
                             </w:r>
                             <w:r>
                               <w:rPr>
@@ -8645,20 +8713,14 @@
                       </w:r>
                       <w:r>
                         <w:rPr>
+                          <w:rFonts w:hint="default"/>
                           <w:color w:val="000000"/>
                           <w:sz w:val="24"/>
                           <w:szCs w:val="24"/>
                           <w:u w:val="single"/>
-                        </w:rPr>
-                        <w:t xml:space="preserve">June 2 to June 15, 2026 </w:t>
-                      </w:r>
-                      <w:r>
-                        <w:rPr>
-                          <w:color w:val="000000"/>
-                          <w:sz w:val="24"/>
-                          <w:szCs w:val="24"/>
-                        </w:rPr>
-                        <w:t xml:space="preserve">and posted in three (3) conspicuous places from </w:t>
+                          <w:lang w:val="en-PH"/>
+                        </w:rPr>
+                        <w:t>${date_of_appointment}</w:t>
                       </w:r>
                       <w:r>
                         <w:rPr>
@@ -8667,24 +8729,94 @@
                           <w:szCs w:val="24"/>
                           <w:u w:val="single"/>
                         </w:rPr>
-                        <w:t xml:space="preserve">June 2 to June 15, 2026 </w:t>
-                      </w:r>
-                      <w:r>
-                        <w:rPr>
-                          <w:color w:val="000000"/>
-                          <w:sz w:val="24"/>
-                          <w:szCs w:val="24"/>
-                        </w:rPr>
-                        <w:t xml:space="preserve">in consonance with RA No. 7041. The assessment by the Human Resource Merit Promotion and Selection Board (HRMPSB) started on </w:t>
-                      </w:r>
-                      <w:r>
-                        <w:rPr>
+                        <w:t xml:space="preserve"> to </w:t>
+                      </w:r>
+                      <w:r>
+                        <w:rPr>
+                          <w:rFonts w:hint="default"/>
                           <w:color w:val="000000"/>
                           <w:sz w:val="24"/>
                           <w:szCs w:val="24"/>
                           <w:u w:val="single"/>
-                        </w:rPr>
-                        <w:t>June 16, 2026</w:t>
+                          <w:lang w:val="en-PH"/>
+                        </w:rPr>
+                        <w:t>${date_signed}</w:t>
+                      </w:r>
+                      <w:r>
+                        <w:rPr>
+                          <w:color w:val="000000"/>
+                          <w:sz w:val="24"/>
+                          <w:szCs w:val="24"/>
+                          <w:u w:val="single"/>
+                        </w:rPr>
+                        <w:t xml:space="preserve"> </w:t>
+                      </w:r>
+                      <w:r>
+                        <w:rPr>
+                          <w:color w:val="000000"/>
+                          <w:sz w:val="24"/>
+                          <w:szCs w:val="24"/>
+                        </w:rPr>
+                        <w:t xml:space="preserve">and posted in three (3) conspicuous places from </w:t>
+                      </w:r>
+                      <w:r>
+                        <w:rPr>
+                          <w:rFonts w:hint="default"/>
+                          <w:color w:val="000000"/>
+                          <w:sz w:val="24"/>
+                          <w:szCs w:val="24"/>
+                          <w:u w:val="single"/>
+                          <w:lang w:val="en-PH"/>
+                        </w:rPr>
+                        <w:t>${date_of_appointment}</w:t>
+                      </w:r>
+                      <w:r>
+                        <w:rPr>
+                          <w:color w:val="000000"/>
+                          <w:sz w:val="24"/>
+                          <w:szCs w:val="24"/>
+                          <w:u w:val="single"/>
+                        </w:rPr>
+                        <w:t xml:space="preserve"> to</w:t>
+                      </w:r>
+                      <w:r>
+                        <w:rPr>
+                          <w:rFonts w:hint="default"/>
+                          <w:color w:val="000000"/>
+                          <w:sz w:val="24"/>
+                          <w:szCs w:val="24"/>
+                          <w:u w:val="single"/>
+                          <w:lang w:val="en-PH"/>
+                        </w:rPr>
+                        <w:t xml:space="preserve"> ${date_signed}</w:t>
+                      </w:r>
+                      <w:r>
+                        <w:rPr>
+                          <w:color w:val="000000"/>
+                          <w:sz w:val="24"/>
+                          <w:szCs w:val="24"/>
+                          <w:u w:val="single"/>
+                        </w:rPr>
+                        <w:t xml:space="preserve"> </w:t>
+                      </w:r>
+                      <w:r>
+                        <w:rPr>
+                          <w:color w:val="000000"/>
+                          <w:sz w:val="24"/>
+                          <w:szCs w:val="24"/>
+                        </w:rPr>
+                        <w:t xml:space="preserve">in consonance with RA No. 7041. The assessment by the Human Resource Merit Promotion and Selection Board (HRMPSB) started on </w:t>
+                      </w:r>
+                      <w:r>
+                        <w:rPr>
+                          <w:rFonts w:hint="default"/>
+                          <w:color w:val="000000"/>
+                          <w:sz w:val="24"/>
+                          <w:szCs w:val="24"/>
+                          <w:u w:val="single"/>
+                          <w:lang w:val="en-PH"/>
+                        </w:rPr>
+                        <w:t>${effectivity_date}</w:t>
                       </w:r>
                       <w:r>
                         <w:rPr>
@@ -10209,6 +10341,14 @@
                             </w:tblGrid>
                             <w:tr>
                               <w:tblPrEx>
+                                <w:tblBorders>
+                                  <w:top w:val="single" w:color="000000" w:themeColor="text1" w:sz="4" w:space="0"/>
+                                  <w:left w:val="single" w:color="000000" w:themeColor="text1" w:sz="4" w:space="0"/>
+                                  <w:bottom w:val="single" w:color="000000" w:themeColor="text1" w:sz="4" w:space="0"/>
+                                  <w:right w:val="single" w:color="000000" w:themeColor="text1" w:sz="4" w:space="0"/>
+                                  <w:insideH w:val="single" w:color="000000" w:themeColor="text1" w:sz="4" w:space="0"/>
+                                  <w:insideV w:val="single" w:color="000000" w:themeColor="text1" w:sz="4" w:space="0"/>
+                                </w:tblBorders>
                                 <w:tblCellMar>
                                   <w:top w:w="0" w:type="dxa"/>
                                   <w:left w:w="115" w:type="dxa"/>
@@ -12834,7 +12974,7 @@
   <w:docDefaults>
     <w:rPrDefault>
       <w:rPr>
-        <w:rFonts w:ascii="Times New Roman" w:hAnsi="Times New Roman" w:eastAsia="Times New Roman" w:cs="Times New Roman"/>
+        <w:rFonts w:ascii="Times New Roman" w:hAnsi="Times New Roman" w:eastAsia="SimSun" w:cs="Times New Roman"/>
       </w:rPr>
     </w:rPrDefault>
     <w:pPrDefault/>
@@ -13716,29 +13856,6 @@
 </file>
 
 <file path=customXml/item2.xml><?xml version="1.0" encoding="utf-8"?>
-<b:Sources xmlns:b="http://schemas.openxmlformats.org/officeDocument/2006/bibliography" xmlns="http://schemas.openxmlformats.org/officeDocument/2006/bibliography" SelectedStyle="\APASixthEditionOfficeOnline.xsl" StyleName="APA" Version="6"/>
-</file>
-
-<file path=customXml/item3.xml><?xml version="1.0" encoding="utf-8"?>
-<?mso-contentType ?>
-<FormTemplates xmlns="http://schemas.microsoft.com/sharepoint/v3/contenttype/forms">
-  <Display>DocumentLibraryForm</Display>
-  <Edit>DocumentLibraryForm</Edit>
-  <New>DocumentLibraryForm</New>
-</FormTemplates>
-</file>
-
-<file path=customXml/item4.xml><?xml version="1.0" encoding="utf-8"?>
-<p:properties xmlns:p="http://schemas.microsoft.com/office/2006/metadata/properties" xmlns:xsi="http://www.w3.org/2001/XMLSchema-instance" xmlns:pc="http://schemas.microsoft.com/office/infopath/2007/PartnerControls">
-  <documentManagement>
-    <lcf76f155ced4ddcb4097134ff3c332f xmlns="61535973-5223-4bf4-bdcc-6c7df9166676">
-      <Terms xmlns="http://schemas.microsoft.com/office/infopath/2007/PartnerControls"/>
-    </lcf76f155ced4ddcb4097134ff3c332f>
-  </documentManagement>
-</p:properties>
-</file>
-
-<file path=customXml/item5.xml><?xml version="1.0" encoding="utf-8"?>
 <ct:contentTypeSchema xmlns:ct="http://schemas.microsoft.com/office/2006/metadata/contentType" xmlns:ma="http://schemas.microsoft.com/office/2006/metadata/properties/metaAttributes" ct:_="" ma:_="" ma:contentTypeName="Document" ma:contentTypeID="0x0101004061E9AFAF7CA04B82F43B8373745610" ma:contentTypeVersion="15" ma:contentTypeDescription="Create a new document." ma:contentTypeScope="" ma:versionID="3807037a0979b6ce9196f65959799221">
   <xsd:schema xmlns:xsd="http://www.w3.org/2001/XMLSchema" xmlns:xs="http://www.w3.org/2001/XMLSchema" xmlns:p="http://schemas.microsoft.com/office/2006/metadata/properties" xmlns:ns2="61535973-5223-4bf4-bdcc-6c7df9166676" xmlns:ns3="ab5b6d4b-4285-4680-b1ee-6fe31a63f7d7" targetNamespace="http://schemas.microsoft.com/office/2006/metadata/properties" ma:root="true" ma:fieldsID="0698124c94b6a25b909cbe33b647c32f" ns2:_="" ns3:_="">
     <xsd:import namespace="61535973-5223-4bf4-bdcc-6c7df9166676"/>
@@ -13969,6 +14086,29 @@
 </ct:contentTypeSchema>
 </file>
 
+<file path=customXml/item3.xml><?xml version="1.0" encoding="utf-8"?>
+<p:properties xmlns:p="http://schemas.microsoft.com/office/2006/metadata/properties" xmlns:xsi="http://www.w3.org/2001/XMLSchema-instance" xmlns:pc="http://schemas.microsoft.com/office/infopath/2007/PartnerControls">
+  <documentManagement>
+    <lcf76f155ced4ddcb4097134ff3c332f xmlns="61535973-5223-4bf4-bdcc-6c7df9166676">
+      <Terms xmlns="http://schemas.microsoft.com/office/infopath/2007/PartnerControls"/>
+    </lcf76f155ced4ddcb4097134ff3c332f>
+  </documentManagement>
+</p:properties>
+</file>
+
+<file path=customXml/item4.xml><?xml version="1.0" encoding="utf-8"?>
+<?mso-contentType ?>
+<FormTemplates xmlns="http://schemas.microsoft.com/sharepoint/v3/contenttype/forms">
+  <Display>DocumentLibraryForm</Display>
+  <Edit>DocumentLibraryForm</Edit>
+  <New>DocumentLibraryForm</New>
+</FormTemplates>
+</file>
+
+<file path=customXml/item5.xml><?xml version="1.0" encoding="utf-8"?>
+<b:Sources xmlns:b="http://schemas.openxmlformats.org/officeDocument/2006/bibliography" xmlns="http://schemas.openxmlformats.org/officeDocument/2006/bibliography" SelectedStyle="\APASixthEditionOfficeOnline.xsl" StyleName="APA" Version="6"/>
+</file>
+
 <file path=customXml/itemProps1.xml><?xml version="1.0" encoding="utf-8"?>
 <ds:datastoreItem xmlns:ds="http://schemas.openxmlformats.org/officeDocument/2006/customXml" ds:itemID="{B1977F7D-205B-4081-913C-38D41E755F92}">
   <ds:schemaRefs>
@@ -13978,25 +14118,25 @@
 </file>
 
 <file path=customXml/itemProps2.xml><?xml version="1.0" encoding="utf-8"?>
-<ds:datastoreItem xmlns:ds="http://schemas.openxmlformats.org/officeDocument/2006/customXml" ds:itemID="{547534C1-321D-4C0B-9D51-AA133DA5F584}">
+<ds:datastoreItem xmlns:ds="http://schemas.openxmlformats.org/officeDocument/2006/customXml" ds:itemID="{4C05208C-5CEB-4531-9757-7015881DFAD1}">
   <ds:schemaRefs/>
 </ds:datastoreItem>
 </file>
 
 <file path=customXml/itemProps3.xml><?xml version="1.0" encoding="utf-8"?>
+<ds:datastoreItem xmlns:ds="http://schemas.openxmlformats.org/officeDocument/2006/customXml" ds:itemID="{DD5ADA96-6B37-44C9-916B-603F7A79B272}">
+  <ds:schemaRefs/>
+</ds:datastoreItem>
+</file>
+
+<file path=customXml/itemProps4.xml><?xml version="1.0" encoding="utf-8"?>
 <ds:datastoreItem xmlns:ds="http://schemas.openxmlformats.org/officeDocument/2006/customXml" ds:itemID="{1A5AAE97-7767-4350-BC4C-D8BD8B855F0B}">
   <ds:schemaRefs/>
 </ds:datastoreItem>
 </file>
 
-<file path=customXml/itemProps4.xml><?xml version="1.0" encoding="utf-8"?>
-<ds:datastoreItem xmlns:ds="http://schemas.openxmlformats.org/officeDocument/2006/customXml" ds:itemID="{DD5ADA96-6B37-44C9-916B-603F7A79B272}">
-  <ds:schemaRefs/>
-</ds:datastoreItem>
-</file>
-
 <file path=customXml/itemProps5.xml><?xml version="1.0" encoding="utf-8"?>
-<ds:datastoreItem xmlns:ds="http://schemas.openxmlformats.org/officeDocument/2006/customXml" ds:itemID="{4C05208C-5CEB-4531-9757-7015881DFAD1}">
+<ds:datastoreItem xmlns:ds="http://schemas.openxmlformats.org/officeDocument/2006/customXml" ds:itemID="{547534C1-321D-4C0B-9D51-AA133DA5F584}">
   <ds:schemaRefs/>
 </ds:datastoreItem>
 </file>
</xml_diff>